<commit_message>
CS1101 Unit 8: Rewrite programming assignment — flowing prose explanation, ~750 words, rubric-maximized
</commit_message>
<xml_diff>
--- a/CS1101_Programming_Fundamentals/Unit8_Files/Assignment/Unit8_Programming_Assignment.docx
+++ b/CS1101_Programming_Fundamentals/Unit8_Files/Assignment/Unit8_Programming_Assignment.docx
@@ -121,7 +121,7 @@
         </w:pict>
       </w:r>
     </w:p>
-    <w:bookmarkStart w:id="9" w:name="assignment-overview"/>
+    <w:bookmarkStart w:id="9" w:name="overview"/>
     <w:p>
       <w:pPr>
         <w:pStyle w:val="Heading2"/>
@@ -132,7 +132,7 @@
           <w:rFonts w:ascii="Times New Roman" w:hAnsi="Times New Roman"/>
           <w:sz w:val="24"/>
         </w:rPr>
-        <w:t xml:space="preserve">Assignment Overview</w:t>
+        <w:t xml:space="preserve">Overview</w:t>
       </w:r>
     </w:p>
     <w:p>
@@ -145,7 +145,7 @@
           <w:rFonts w:ascii="Times New Roman" w:hAnsi="Times New Roman"/>
           <w:sz w:val="24"/>
         </w:rPr>
-        <w:t xml:space="preserve">This program reads a dictionary from a text file, inverts it so that values become keys mapping to lists of original keys, and writes the inverted dictionary to a new output file. Exception handling is used throughout to manage file errors gracefully.</w:t>
+        <w:t xml:space="preserve">One of the most practical skills in programming is being able to store data in a file and retrieve it later. In this assignment, I built a program that reads a dictionary from a plain text file, inverts it so that values become keys and keys become grouped values, and writes the result to a separate output file. The program uses exception handling throughout so that file errors are caught and reported gracefully rather than crashing the program. All three components — the input file, the Python program, and the output file — are shown below with a full technical explanation.</w:t>
       </w:r>
     </w:p>
     <w:p>
@@ -163,7 +163,7 @@
       </w:r>
     </w:p>
     <w:bookmarkEnd w:id="9"/>
-    <w:bookmarkStart w:id="10" w:name="input-file-fruits.txt"/>
+    <w:bookmarkStart w:id="10" w:name="component-1-input-file-fruits.txt"/>
     <w:p>
       <w:pPr>
         <w:pStyle w:val="Heading2"/>
@@ -174,7 +174,7 @@
           <w:rFonts w:ascii="Times New Roman" w:hAnsi="Times New Roman"/>
           <w:sz w:val="24"/>
         </w:rPr>
-        <w:t xml:space="preserve">Input File:</w:t>
+        <w:t xml:space="preserve">Component 1: Input File —</w:t>
       </w:r>
       <w:r>
         <w:rPr>
@@ -321,7 +321,7 @@
           <w:rFonts w:ascii="Times New Roman" w:hAnsi="Times New Roman"/>
           <w:sz w:val="24"/>
         </w:rPr>
-        <w:t xml:space="preserve">The input file contains eight fruit-to-color mappings, one per line, in</w:t>
+        <w:t xml:space="preserve">The input file contains eight fruit-to-color mappings, one per line, using the format</w:t>
       </w:r>
       <w:r>
         <w:rPr>
@@ -343,14 +343,7 @@
           <w:rFonts w:ascii="Times New Roman" w:hAnsi="Times New Roman"/>
           <w:sz w:val="24"/>
         </w:rPr>
-        <w:t xml:space="preserve"> </w:t>
-      </w:r>
-      <w:r>
-        <w:rPr>
-          <w:rFonts w:ascii="Times New Roman" w:hAnsi="Times New Roman"/>
-          <w:sz w:val="24"/>
-        </w:rPr>
-        <w:t xml:space="preserve">format. Three fruits share the color</w:t>
+        <w:t xml:space="preserve">. I chose this dataset because it has deliberate repetition — three fruits share the color</w:t>
       </w:r>
       <w:r>
         <w:rPr>
@@ -394,7 +387,7 @@
           <w:rFonts w:ascii="Times New Roman" w:hAnsi="Times New Roman"/>
           <w:sz w:val="24"/>
         </w:rPr>
-        <w:t xml:space="preserve">, and the remaining three have unique colors.</w:t>
+        <w:t xml:space="preserve">, and the remaining three have unique colors. This makes the inversion interesting: the output will show how multiple original keys collapse into a single new key with a list of values.</w:t>
       </w:r>
     </w:p>
     <w:p>
@@ -412,7 +405,7 @@
       </w:r>
     </w:p>
     <w:bookmarkEnd w:id="10"/>
-    <w:bookmarkStart w:id="11" w:name="python-program-file_dict.py"/>
+    <w:bookmarkStart w:id="11" w:name="component-2-python-program-file_dict.py"/>
     <w:p>
       <w:pPr>
         <w:pStyle w:val="Heading2"/>
@@ -423,7 +416,7 @@
           <w:rFonts w:ascii="Times New Roman" w:hAnsi="Times New Roman"/>
           <w:sz w:val="24"/>
         </w:rPr>
-        <w:t xml:space="preserve">Python Program:</w:t>
+        <w:t xml:space="preserve">Component 2: Python Program —</w:t>
       </w:r>
       <w:r>
         <w:rPr>
@@ -3377,7 +3370,7 @@
       </w:r>
     </w:p>
     <w:bookmarkEnd w:id="12"/>
-    <w:bookmarkStart w:id="13" w:name="output-file-fruits_inverted.txt"/>
+    <w:bookmarkStart w:id="13" w:name="Xd08c90e04eb555bb4eedeee37103588a2f8d71c"/>
     <w:p>
       <w:pPr>
         <w:pStyle w:val="Heading2"/>
@@ -3388,7 +3381,7 @@
           <w:rFonts w:ascii="Times New Roman" w:hAnsi="Times New Roman"/>
           <w:sz w:val="24"/>
         </w:rPr>
-        <w:t xml:space="preserve">Output File:</w:t>
+        <w:t xml:space="preserve">Component 3: Output File —</w:t>
       </w:r>
       <w:r>
         <w:rPr>
@@ -3478,6 +3471,19 @@
           <w:sz w:val="24"/>
         </w:rPr>
         <w:t xml:space="preserve">purple: plum</w:t>
+      </w:r>
+    </w:p>
+    <w:p>
+      <w:pPr>
+        <w:pStyle w:val="FirstParagraph"/>
+        <w:spacing w:line="480" w:lineRule="auto" w:after="0"/>
+      </w:pPr>
+      <w:r>
+        <w:rPr>
+          <w:rFonts w:ascii="Times New Roman" w:hAnsi="Times New Roman"/>
+          <w:sz w:val="24"/>
+        </w:rPr>
+        <w:t xml:space="preserve">The output file has five lines — one for each unique color in the original dictionary. Colors that appeared multiple times in the input now map to a comma-separated list of all the fruits that had that color.</w:t>
       </w:r>
     </w:p>
     <w:p>
@@ -3519,7 +3525,80 @@
           <w:rFonts w:ascii="Times New Roman" w:hAnsi="Times New Roman"/>
           <w:sz w:val="24"/>
         </w:rPr>
-        <w:t xml:space="preserve">This program demonstrates three core concepts from Chapter 14 of Downey (2015): reading from files, writing to files, and catching exceptions.</w:t>
+        <w:t xml:space="preserve">This program is organized into three functions —</w:t>
+      </w:r>
+      <w:r>
+        <w:rPr>
+          <w:rFonts w:ascii="Times New Roman" w:hAnsi="Times New Roman"/>
+          <w:sz w:val="24"/>
+        </w:rPr>
+        <w:t xml:space="preserve"> </w:t>
+      </w:r>
+      <w:r>
+        <w:rPr>
+          <w:rStyle w:val="VerbatimChar"/>
+          <w:rFonts w:ascii="Times New Roman" w:hAnsi="Times New Roman"/>
+          <w:sz w:val="24"/>
+        </w:rPr>
+        <w:t xml:space="preserve">read_dict_from_file</w:t>
+      </w:r>
+      <w:r>
+        <w:rPr>
+          <w:rFonts w:ascii="Times New Roman" w:hAnsi="Times New Roman"/>
+          <w:sz w:val="24"/>
+        </w:rPr>
+        <w:t xml:space="preserve">,</w:t>
+      </w:r>
+      <w:r>
+        <w:rPr>
+          <w:rFonts w:ascii="Times New Roman" w:hAnsi="Times New Roman"/>
+          <w:sz w:val="24"/>
+        </w:rPr>
+        <w:t xml:space="preserve"> </w:t>
+      </w:r>
+      <w:r>
+        <w:rPr>
+          <w:rStyle w:val="VerbatimChar"/>
+          <w:rFonts w:ascii="Times New Roman" w:hAnsi="Times New Roman"/>
+          <w:sz w:val="24"/>
+        </w:rPr>
+        <w:t xml:space="preserve">invert_dict</w:t>
+      </w:r>
+      <w:r>
+        <w:rPr>
+          <w:rFonts w:ascii="Times New Roman" w:hAnsi="Times New Roman"/>
+          <w:sz w:val="24"/>
+        </w:rPr>
+        <w:t xml:space="preserve">, and</w:t>
+      </w:r>
+      <w:r>
+        <w:rPr>
+          <w:rFonts w:ascii="Times New Roman" w:hAnsi="Times New Roman"/>
+          <w:sz w:val="24"/>
+        </w:rPr>
+        <w:t xml:space="preserve"> </w:t>
+      </w:r>
+      <w:r>
+        <w:rPr>
+          <w:rStyle w:val="VerbatimChar"/>
+          <w:rFonts w:ascii="Times New Roman" w:hAnsi="Times New Roman"/>
+          <w:sz w:val="24"/>
+        </w:rPr>
+        <w:t xml:space="preserve">write_dict_to_file</w:t>
+      </w:r>
+      <w:r>
+        <w:rPr>
+          <w:rFonts w:ascii="Times New Roman" w:hAnsi="Times New Roman"/>
+          <w:sz w:val="24"/>
+        </w:rPr>
+        <w:t xml:space="preserve"> </w:t>
+      </w:r>
+      <w:r>
+        <w:rPr>
+          <w:rFonts w:ascii="Times New Roman" w:hAnsi="Times New Roman"/>
+          <w:sz w:val="24"/>
+        </w:rPr>
+        <w:t xml:space="preserve">— each responsible for exactly one step of the process. Keeping the responsibilities separate makes the code easier to read, test, and reuse. I will explain each function in turn, then discuss the exception handling strategy.</w:t>
       </w:r>
     </w:p>
     <w:p>
@@ -3534,291 +3613,7 @@
           <w:bCs/>
           <w:sz w:val="24"/>
         </w:rPr>
-        <w:t xml:space="preserve">Reading the file</w:t>
-      </w:r>
-      <w:r>
-        <w:rPr>
-          <w:rFonts w:ascii="Times New Roman" w:hAnsi="Times New Roman"/>
-          <w:sz w:val="24"/>
-        </w:rPr>
-        <w:t xml:space="preserve">: The</w:t>
-      </w:r>
-      <w:r>
-        <w:rPr>
-          <w:rFonts w:ascii="Times New Roman" w:hAnsi="Times New Roman"/>
-          <w:sz w:val="24"/>
-        </w:rPr>
-        <w:t xml:space="preserve"> </w:t>
-      </w:r>
-      <w:r>
-        <w:rPr>
-          <w:rStyle w:val="VerbatimChar"/>
-          <w:rFonts w:ascii="Times New Roman" w:hAnsi="Times New Roman"/>
-          <w:sz w:val="24"/>
-        </w:rPr>
-        <w:t xml:space="preserve">read_dict_from_file</w:t>
-      </w:r>
-      <w:r>
-        <w:rPr>
-          <w:rFonts w:ascii="Times New Roman" w:hAnsi="Times New Roman"/>
-          <w:sz w:val="24"/>
-        </w:rPr>
-        <w:t xml:space="preserve"> </w:t>
-      </w:r>
-      <w:r>
-        <w:rPr>
-          <w:rFonts w:ascii="Times New Roman" w:hAnsi="Times New Roman"/>
-          <w:sz w:val="24"/>
-        </w:rPr>
-        <w:t xml:space="preserve">function opens</w:t>
-      </w:r>
-      <w:r>
-        <w:rPr>
-          <w:rFonts w:ascii="Times New Roman" w:hAnsi="Times New Roman"/>
-          <w:sz w:val="24"/>
-        </w:rPr>
-        <w:t xml:space="preserve"> </w:t>
-      </w:r>
-      <w:r>
-        <w:rPr>
-          <w:rStyle w:val="VerbatimChar"/>
-          <w:rFonts w:ascii="Times New Roman" w:hAnsi="Times New Roman"/>
-          <w:sz w:val="24"/>
-        </w:rPr>
-        <w:t xml:space="preserve">fruits.txt</w:t>
-      </w:r>
-      <w:r>
-        <w:rPr>
-          <w:rFonts w:ascii="Times New Roman" w:hAnsi="Times New Roman"/>
-          <w:sz w:val="24"/>
-        </w:rPr>
-        <w:t xml:space="preserve"> </w:t>
-      </w:r>
-      <w:r>
-        <w:rPr>
-          <w:rFonts w:ascii="Times New Roman" w:hAnsi="Times New Roman"/>
-          <w:sz w:val="24"/>
-        </w:rPr>
-        <w:t xml:space="preserve">using Python’s built-in</w:t>
-      </w:r>
-      <w:r>
-        <w:rPr>
-          <w:rFonts w:ascii="Times New Roman" w:hAnsi="Times New Roman"/>
-          <w:sz w:val="24"/>
-        </w:rPr>
-        <w:t xml:space="preserve"> </w:t>
-      </w:r>
-      <w:r>
-        <w:rPr>
-          <w:rStyle w:val="VerbatimChar"/>
-          <w:rFonts w:ascii="Times New Roman" w:hAnsi="Times New Roman"/>
-          <w:sz w:val="24"/>
-        </w:rPr>
-        <w:t xml:space="preserve">open()</w:t>
-      </w:r>
-      <w:r>
-        <w:rPr>
-          <w:rFonts w:ascii="Times New Roman" w:hAnsi="Times New Roman"/>
-          <w:sz w:val="24"/>
-        </w:rPr>
-        <w:t xml:space="preserve"> </w:t>
-      </w:r>
-      <w:r>
-        <w:rPr>
-          <w:rFonts w:ascii="Times New Roman" w:hAnsi="Times New Roman"/>
-          <w:sz w:val="24"/>
-        </w:rPr>
-        <w:t xml:space="preserve">function in read mode (</w:t>
-      </w:r>
-      <w:r>
-        <w:rPr>
-          <w:rStyle w:val="VerbatimChar"/>
-          <w:rFonts w:ascii="Times New Roman" w:hAnsi="Times New Roman"/>
-          <w:sz w:val="24"/>
-        </w:rPr>
-        <w:t xml:space="preserve">'r'</w:t>
-      </w:r>
-      <w:r>
-        <w:rPr>
-          <w:rFonts w:ascii="Times New Roman" w:hAnsi="Times New Roman"/>
-          <w:sz w:val="24"/>
-        </w:rPr>
-        <w:t xml:space="preserve">). The</w:t>
-      </w:r>
-      <w:r>
-        <w:rPr>
-          <w:rFonts w:ascii="Times New Roman" w:hAnsi="Times New Roman"/>
-          <w:sz w:val="24"/>
-        </w:rPr>
-        <w:t xml:space="preserve"> </w:t>
-      </w:r>
-      <w:r>
-        <w:rPr>
-          <w:rStyle w:val="VerbatimChar"/>
-          <w:rFonts w:ascii="Times New Roman" w:hAnsi="Times New Roman"/>
-          <w:sz w:val="24"/>
-        </w:rPr>
-        <w:t xml:space="preserve">with</w:t>
-      </w:r>
-      <w:r>
-        <w:rPr>
-          <w:rFonts w:ascii="Times New Roman" w:hAnsi="Times New Roman"/>
-          <w:sz w:val="24"/>
-        </w:rPr>
-        <w:t xml:space="preserve"> </w:t>
-      </w:r>
-      <w:r>
-        <w:rPr>
-          <w:rFonts w:ascii="Times New Roman" w:hAnsi="Times New Roman"/>
-          <w:sz w:val="24"/>
-        </w:rPr>
-        <w:t xml:space="preserve">statement is used as a context manager, which guarantees the file is closed automatically when the block exits — even if an error occurs inside it (Downey, 2015, p. 141). The function iterates over the file line by line using a</w:t>
-      </w:r>
-      <w:r>
-        <w:rPr>
-          <w:rFonts w:ascii="Times New Roman" w:hAnsi="Times New Roman"/>
-          <w:sz w:val="24"/>
-        </w:rPr>
-        <w:t xml:space="preserve"> </w:t>
-      </w:r>
-      <w:r>
-        <w:rPr>
-          <w:rStyle w:val="VerbatimChar"/>
-          <w:rFonts w:ascii="Times New Roman" w:hAnsi="Times New Roman"/>
-          <w:sz w:val="24"/>
-        </w:rPr>
-        <w:t xml:space="preserve">for</w:t>
-      </w:r>
-      <w:r>
-        <w:rPr>
-          <w:rFonts w:ascii="Times New Roman" w:hAnsi="Times New Roman"/>
-          <w:sz w:val="24"/>
-        </w:rPr>
-        <w:t xml:space="preserve"> </w:t>
-      </w:r>
-      <w:r>
-        <w:rPr>
-          <w:rFonts w:ascii="Times New Roman" w:hAnsi="Times New Roman"/>
-          <w:sz w:val="24"/>
-        </w:rPr>
-        <w:t xml:space="preserve">loop. Each line is stripped of leading and trailing whitespace using</w:t>
-      </w:r>
-      <w:r>
-        <w:rPr>
-          <w:rFonts w:ascii="Times New Roman" w:hAnsi="Times New Roman"/>
-          <w:sz w:val="24"/>
-        </w:rPr>
-        <w:t xml:space="preserve"> </w:t>
-      </w:r>
-      <w:r>
-        <w:rPr>
-          <w:rStyle w:val="VerbatimChar"/>
-          <w:rFonts w:ascii="Times New Roman" w:hAnsi="Times New Roman"/>
-          <w:sz w:val="24"/>
-        </w:rPr>
-        <w:t xml:space="preserve">.strip()</w:t>
-      </w:r>
-      <w:r>
-        <w:rPr>
-          <w:rFonts w:ascii="Times New Roman" w:hAnsi="Times New Roman"/>
-          <w:sz w:val="24"/>
-        </w:rPr>
-        <w:t xml:space="preserve">, then split on the first colon using</w:t>
-      </w:r>
-      <w:r>
-        <w:rPr>
-          <w:rFonts w:ascii="Times New Roman" w:hAnsi="Times New Roman"/>
-          <w:sz w:val="24"/>
-        </w:rPr>
-        <w:t xml:space="preserve"> </w:t>
-      </w:r>
-      <w:r>
-        <w:rPr>
-          <w:rStyle w:val="VerbatimChar"/>
-          <w:rFonts w:ascii="Times New Roman" w:hAnsi="Times New Roman"/>
-          <w:sz w:val="24"/>
-        </w:rPr>
-        <w:t xml:space="preserve">line.split(':', 1)</w:t>
-      </w:r>
-      <w:r>
-        <w:rPr>
-          <w:rFonts w:ascii="Times New Roman" w:hAnsi="Times New Roman"/>
-          <w:sz w:val="24"/>
-        </w:rPr>
-        <w:t xml:space="preserve">. The</w:t>
-      </w:r>
-      <w:r>
-        <w:rPr>
-          <w:rFonts w:ascii="Times New Roman" w:hAnsi="Times New Roman"/>
-          <w:sz w:val="24"/>
-        </w:rPr>
-        <w:t xml:space="preserve"> </w:t>
-      </w:r>
-      <w:r>
-        <w:rPr>
-          <w:rStyle w:val="VerbatimChar"/>
-          <w:rFonts w:ascii="Times New Roman" w:hAnsi="Times New Roman"/>
-          <w:sz w:val="24"/>
-        </w:rPr>
-        <w:t xml:space="preserve">1</w:t>
-      </w:r>
-      <w:r>
-        <w:rPr>
-          <w:rFonts w:ascii="Times New Roman" w:hAnsi="Times New Roman"/>
-          <w:sz w:val="24"/>
-        </w:rPr>
-        <w:t xml:space="preserve"> </w:t>
-      </w:r>
-      <w:r>
-        <w:rPr>
-          <w:rFonts w:ascii="Times New Roman" w:hAnsi="Times New Roman"/>
-          <w:sz w:val="24"/>
-        </w:rPr>
-        <w:t xml:space="preserve">argument limits the split to one occurrence, which prevents problems if a value itself contains a colon. Blank lines and malformed lines (those without a colon) are skipped using</w:t>
-      </w:r>
-      <w:r>
-        <w:rPr>
-          <w:rFonts w:ascii="Times New Roman" w:hAnsi="Times New Roman"/>
-          <w:sz w:val="24"/>
-        </w:rPr>
-        <w:t xml:space="preserve"> </w:t>
-      </w:r>
-      <w:r>
-        <w:rPr>
-          <w:rStyle w:val="VerbatimChar"/>
-          <w:rFonts w:ascii="Times New Roman" w:hAnsi="Times New Roman"/>
-          <w:sz w:val="24"/>
-        </w:rPr>
-        <w:t xml:space="preserve">continue</w:t>
-      </w:r>
-      <w:r>
-        <w:rPr>
-          <w:rFonts w:ascii="Times New Roman" w:hAnsi="Times New Roman"/>
-          <w:sz w:val="24"/>
-        </w:rPr>
-        <w:t xml:space="preserve">. The resulting key-value pairs are stored in a dictionary</w:t>
-      </w:r>
-      <w:r>
-        <w:rPr>
-          <w:rFonts w:ascii="Times New Roman" w:hAnsi="Times New Roman"/>
-          <w:sz w:val="24"/>
-        </w:rPr>
-        <w:t xml:space="preserve"> </w:t>
-      </w:r>
-      <w:r>
-        <w:rPr>
-          <w:rStyle w:val="VerbatimChar"/>
-          <w:rFonts w:ascii="Times New Roman" w:hAnsi="Times New Roman"/>
-          <w:sz w:val="24"/>
-        </w:rPr>
-        <w:t xml:space="preserve">d</w:t>
-      </w:r>
-      <w:r>
-        <w:rPr>
-          <w:rFonts w:ascii="Times New Roman" w:hAnsi="Times New Roman"/>
-          <w:sz w:val="24"/>
-        </w:rPr>
-        <w:t xml:space="preserve">, which is returned to the caller.</w:t>
+        <w:t xml:space="preserve">Reading the file into a dictionary</w:t>
       </w:r>
     </w:p>
     <w:p>
@@ -3829,156 +3624,198 @@
       <w:r>
         <w:rPr>
           <w:rFonts w:ascii="Times New Roman" w:hAnsi="Times New Roman"/>
-          <w:b/>
-          <w:bCs/>
-          <w:sz w:val="24"/>
-        </w:rPr>
-        <w:t xml:space="preserve">Inverting the dictionary</w:t>
-      </w:r>
-      <w:r>
-        <w:rPr>
-          <w:rFonts w:ascii="Times New Roman" w:hAnsi="Times New Roman"/>
-          <w:sz w:val="24"/>
-        </w:rPr>
-        <w:t xml:space="preserve">: The</w:t>
-      </w:r>
-      <w:r>
-        <w:rPr>
-          <w:rFonts w:ascii="Times New Roman" w:hAnsi="Times New Roman"/>
-          <w:sz w:val="24"/>
-        </w:rPr>
-        <w:t xml:space="preserve"> </w:t>
-      </w:r>
-      <w:r>
-        <w:rPr>
-          <w:rStyle w:val="VerbatimChar"/>
-          <w:rFonts w:ascii="Times New Roman" w:hAnsi="Times New Roman"/>
-          <w:sz w:val="24"/>
-        </w:rPr>
-        <w:t xml:space="preserve">invert_dict</w:t>
-      </w:r>
-      <w:r>
-        <w:rPr>
-          <w:rFonts w:ascii="Times New Roman" w:hAnsi="Times New Roman"/>
-          <w:sz w:val="24"/>
-        </w:rPr>
-        <w:t xml:space="preserve"> </w:t>
-      </w:r>
-      <w:r>
-        <w:rPr>
-          <w:rFonts w:ascii="Times New Roman" w:hAnsi="Times New Roman"/>
-          <w:sz w:val="24"/>
-        </w:rPr>
-        <w:t xml:space="preserve">function iterates over the original dictionary using</w:t>
-      </w:r>
-      <w:r>
-        <w:rPr>
-          <w:rFonts w:ascii="Times New Roman" w:hAnsi="Times New Roman"/>
-          <w:sz w:val="24"/>
-        </w:rPr>
-        <w:t xml:space="preserve"> </w:t>
-      </w:r>
-      <w:r>
-        <w:rPr>
-          <w:rStyle w:val="VerbatimChar"/>
-          <w:rFonts w:ascii="Times New Roman" w:hAnsi="Times New Roman"/>
-          <w:sz w:val="24"/>
-        </w:rPr>
-        <w:t xml:space="preserve">.items()</w:t>
-      </w:r>
-      <w:r>
-        <w:rPr>
-          <w:rFonts w:ascii="Times New Roman" w:hAnsi="Times New Roman"/>
-          <w:sz w:val="24"/>
-        </w:rPr>
-        <w:t xml:space="preserve">, which yields each key-value pair as a tuple. For each pair, the original value becomes the new key in the</w:t>
-      </w:r>
-      <w:r>
-        <w:rPr>
-          <w:rFonts w:ascii="Times New Roman" w:hAnsi="Times New Roman"/>
-          <w:sz w:val="24"/>
-        </w:rPr>
-        <w:t xml:space="preserve"> </w:t>
-      </w:r>
-      <w:r>
-        <w:rPr>
-          <w:rStyle w:val="VerbatimChar"/>
-          <w:rFonts w:ascii="Times New Roman" w:hAnsi="Times New Roman"/>
-          <w:sz w:val="24"/>
-        </w:rPr>
-        <w:t xml:space="preserve">inverse</w:t>
-      </w:r>
-      <w:r>
-        <w:rPr>
-          <w:rFonts w:ascii="Times New Roman" w:hAnsi="Times New Roman"/>
-          <w:sz w:val="24"/>
-        </w:rPr>
-        <w:t xml:space="preserve"> </w:t>
-      </w:r>
-      <w:r>
-        <w:rPr>
-          <w:rFonts w:ascii="Times New Roman" w:hAnsi="Times New Roman"/>
-          <w:sz w:val="24"/>
-        </w:rPr>
-        <w:t xml:space="preserve">dictionary, and the original key is appended to a list of values. The check</w:t>
-      </w:r>
-      <w:r>
-        <w:rPr>
-          <w:rFonts w:ascii="Times New Roman" w:hAnsi="Times New Roman"/>
-          <w:sz w:val="24"/>
-        </w:rPr>
-        <w:t xml:space="preserve"> </w:t>
-      </w:r>
-      <w:r>
-        <w:rPr>
-          <w:rStyle w:val="VerbatimChar"/>
-          <w:rFonts w:ascii="Times New Roman" w:hAnsi="Times New Roman"/>
-          <w:sz w:val="24"/>
-        </w:rPr>
-        <w:t xml:space="preserve">if value not in inverse</w:t>
-      </w:r>
-      <w:r>
-        <w:rPr>
-          <w:rFonts w:ascii="Times New Roman" w:hAnsi="Times New Roman"/>
-          <w:sz w:val="24"/>
-        </w:rPr>
-        <w:t xml:space="preserve"> </w:t>
-      </w:r>
-      <w:r>
-        <w:rPr>
-          <w:rFonts w:ascii="Times New Roman" w:hAnsi="Times New Roman"/>
-          <w:sz w:val="24"/>
-        </w:rPr>
-        <w:t xml:space="preserve">handles the first occurrence of each color — creating a new list — while the</w:t>
-      </w:r>
-      <w:r>
-        <w:rPr>
-          <w:rFonts w:ascii="Times New Roman" w:hAnsi="Times New Roman"/>
-          <w:sz w:val="24"/>
-        </w:rPr>
-        <w:t xml:space="preserve"> </w:t>
-      </w:r>
-      <w:r>
-        <w:rPr>
-          <w:rStyle w:val="VerbatimChar"/>
-          <w:rFonts w:ascii="Times New Roman" w:hAnsi="Times New Roman"/>
-          <w:sz w:val="24"/>
-        </w:rPr>
-        <w:t xml:space="preserve">else</w:t>
-      </w:r>
-      <w:r>
-        <w:rPr>
-          <w:rFonts w:ascii="Times New Roman" w:hAnsi="Times New Roman"/>
-          <w:sz w:val="24"/>
-        </w:rPr>
-        <w:t xml:space="preserve"> </w:t>
-      </w:r>
-      <w:r>
-        <w:rPr>
-          <w:rFonts w:ascii="Times New Roman" w:hAnsi="Times New Roman"/>
-          <w:sz w:val="24"/>
-        </w:rPr>
-        <w:t xml:space="preserve">branch appends to the existing list for subsequent occurrences. This is the same pattern used in the Unit 7 assignment, now applied to file-sourced data (Downey, 2015, p. 121).</w:t>
+          <w:sz w:val="24"/>
+        </w:rPr>
+        <w:t xml:space="preserve">The</w:t>
+      </w:r>
+      <w:r>
+        <w:rPr>
+          <w:rFonts w:ascii="Times New Roman" w:hAnsi="Times New Roman"/>
+          <w:sz w:val="24"/>
+        </w:rPr>
+        <w:t xml:space="preserve"> </w:t>
+      </w:r>
+      <w:r>
+        <w:rPr>
+          <w:rStyle w:val="VerbatimChar"/>
+          <w:rFonts w:ascii="Times New Roman" w:hAnsi="Times New Roman"/>
+          <w:sz w:val="24"/>
+        </w:rPr>
+        <w:t xml:space="preserve">read_dict_from_file</w:t>
+      </w:r>
+      <w:r>
+        <w:rPr>
+          <w:rFonts w:ascii="Times New Roman" w:hAnsi="Times New Roman"/>
+          <w:sz w:val="24"/>
+        </w:rPr>
+        <w:t xml:space="preserve"> </w:t>
+      </w:r>
+      <w:r>
+        <w:rPr>
+          <w:rFonts w:ascii="Times New Roman" w:hAnsi="Times New Roman"/>
+          <w:sz w:val="24"/>
+        </w:rPr>
+        <w:t xml:space="preserve">function opens</w:t>
+      </w:r>
+      <w:r>
+        <w:rPr>
+          <w:rFonts w:ascii="Times New Roman" w:hAnsi="Times New Roman"/>
+          <w:sz w:val="24"/>
+        </w:rPr>
+        <w:t xml:space="preserve"> </w:t>
+      </w:r>
+      <w:r>
+        <w:rPr>
+          <w:rStyle w:val="VerbatimChar"/>
+          <w:rFonts w:ascii="Times New Roman" w:hAnsi="Times New Roman"/>
+          <w:sz w:val="24"/>
+        </w:rPr>
+        <w:t xml:space="preserve">fruits.txt</w:t>
+      </w:r>
+      <w:r>
+        <w:rPr>
+          <w:rFonts w:ascii="Times New Roman" w:hAnsi="Times New Roman"/>
+          <w:sz w:val="24"/>
+        </w:rPr>
+        <w:t xml:space="preserve"> </w:t>
+      </w:r>
+      <w:r>
+        <w:rPr>
+          <w:rFonts w:ascii="Times New Roman" w:hAnsi="Times New Roman"/>
+          <w:sz w:val="24"/>
+        </w:rPr>
+        <w:t xml:space="preserve">using Python’s built-in</w:t>
+      </w:r>
+      <w:r>
+        <w:rPr>
+          <w:rFonts w:ascii="Times New Roman" w:hAnsi="Times New Roman"/>
+          <w:sz w:val="24"/>
+        </w:rPr>
+        <w:t xml:space="preserve"> </w:t>
+      </w:r>
+      <w:r>
+        <w:rPr>
+          <w:rStyle w:val="VerbatimChar"/>
+          <w:rFonts w:ascii="Times New Roman" w:hAnsi="Times New Roman"/>
+          <w:sz w:val="24"/>
+        </w:rPr>
+        <w:t xml:space="preserve">open()</w:t>
+      </w:r>
+      <w:r>
+        <w:rPr>
+          <w:rFonts w:ascii="Times New Roman" w:hAnsi="Times New Roman"/>
+          <w:sz w:val="24"/>
+        </w:rPr>
+        <w:t xml:space="preserve"> </w:t>
+      </w:r>
+      <w:r>
+        <w:rPr>
+          <w:rFonts w:ascii="Times New Roman" w:hAnsi="Times New Roman"/>
+          <w:sz w:val="24"/>
+        </w:rPr>
+        <w:t xml:space="preserve">function in read mode (</w:t>
+      </w:r>
+      <w:r>
+        <w:rPr>
+          <w:rStyle w:val="VerbatimChar"/>
+          <w:rFonts w:ascii="Times New Roman" w:hAnsi="Times New Roman"/>
+          <w:sz w:val="24"/>
+        </w:rPr>
+        <w:t xml:space="preserve">'r'</w:t>
+      </w:r>
+      <w:r>
+        <w:rPr>
+          <w:rFonts w:ascii="Times New Roman" w:hAnsi="Times New Roman"/>
+          <w:sz w:val="24"/>
+        </w:rPr>
+        <w:t xml:space="preserve">). Rather than calling</w:t>
+      </w:r>
+      <w:r>
+        <w:rPr>
+          <w:rFonts w:ascii="Times New Roman" w:hAnsi="Times New Roman"/>
+          <w:sz w:val="24"/>
+        </w:rPr>
+        <w:t xml:space="preserve"> </w:t>
+      </w:r>
+      <w:r>
+        <w:rPr>
+          <w:rStyle w:val="VerbatimChar"/>
+          <w:rFonts w:ascii="Times New Roman" w:hAnsi="Times New Roman"/>
+          <w:sz w:val="24"/>
+        </w:rPr>
+        <w:t xml:space="preserve">f.close()</w:t>
+      </w:r>
+      <w:r>
+        <w:rPr>
+          <w:rFonts w:ascii="Times New Roman" w:hAnsi="Times New Roman"/>
+          <w:sz w:val="24"/>
+        </w:rPr>
+        <w:t xml:space="preserve"> </w:t>
+      </w:r>
+      <w:r>
+        <w:rPr>
+          <w:rFonts w:ascii="Times New Roman" w:hAnsi="Times New Roman"/>
+          <w:sz w:val="24"/>
+        </w:rPr>
+        <w:t xml:space="preserve">manually, I used the</w:t>
+      </w:r>
+      <w:r>
+        <w:rPr>
+          <w:rFonts w:ascii="Times New Roman" w:hAnsi="Times New Roman"/>
+          <w:sz w:val="24"/>
+        </w:rPr>
+        <w:t xml:space="preserve"> </w:t>
+      </w:r>
+      <w:r>
+        <w:rPr>
+          <w:rStyle w:val="VerbatimChar"/>
+          <w:rFonts w:ascii="Times New Roman" w:hAnsi="Times New Roman"/>
+          <w:sz w:val="24"/>
+        </w:rPr>
+        <w:t xml:space="preserve">with</w:t>
+      </w:r>
+      <w:r>
+        <w:rPr>
+          <w:rFonts w:ascii="Times New Roman" w:hAnsi="Times New Roman"/>
+          <w:sz w:val="24"/>
+        </w:rPr>
+        <w:t xml:space="preserve"> </w:t>
+      </w:r>
+      <w:r>
+        <w:rPr>
+          <w:rFonts w:ascii="Times New Roman" w:hAnsi="Times New Roman"/>
+          <w:sz w:val="24"/>
+        </w:rPr>
+        <w:t xml:space="preserve">statement as a context manager. As Downey (2015) explains, the</w:t>
+      </w:r>
+      <w:r>
+        <w:rPr>
+          <w:rFonts w:ascii="Times New Roman" w:hAnsi="Times New Roman"/>
+          <w:sz w:val="24"/>
+        </w:rPr>
+        <w:t xml:space="preserve"> </w:t>
+      </w:r>
+      <w:r>
+        <w:rPr>
+          <w:rStyle w:val="VerbatimChar"/>
+          <w:rFonts w:ascii="Times New Roman" w:hAnsi="Times New Roman"/>
+          <w:sz w:val="24"/>
+        </w:rPr>
+        <w:t xml:space="preserve">with</w:t>
+      </w:r>
+      <w:r>
+        <w:rPr>
+          <w:rFonts w:ascii="Times New Roman" w:hAnsi="Times New Roman"/>
+          <w:sz w:val="24"/>
+        </w:rPr>
+        <w:t xml:space="preserve"> </w:t>
+      </w:r>
+      <w:r>
+        <w:rPr>
+          <w:rFonts w:ascii="Times New Roman" w:hAnsi="Times New Roman"/>
+          <w:sz w:val="24"/>
+        </w:rPr>
+        <w:t xml:space="preserve">statement guarantees that the file is closed automatically when the block exits, even if an error occurs inside it — which prevents resource leaks that can accumulate in longer-running programs (p. 141).</w:t>
       </w:r>
     </w:p>
     <w:p>
@@ -3989,128 +3826,235 @@
       <w:r>
         <w:rPr>
           <w:rFonts w:ascii="Times New Roman" w:hAnsi="Times New Roman"/>
-          <w:b/>
-          <w:bCs/>
-          <w:sz w:val="24"/>
-        </w:rPr>
-        <w:t xml:space="preserve">Writing the output file</w:t>
-      </w:r>
-      <w:r>
-        <w:rPr>
-          <w:rFonts w:ascii="Times New Roman" w:hAnsi="Times New Roman"/>
-          <w:sz w:val="24"/>
-        </w:rPr>
-        <w:t xml:space="preserve">: The</w:t>
-      </w:r>
-      <w:r>
-        <w:rPr>
-          <w:rFonts w:ascii="Times New Roman" w:hAnsi="Times New Roman"/>
-          <w:sz w:val="24"/>
-        </w:rPr>
-        <w:t xml:space="preserve"> </w:t>
-      </w:r>
-      <w:r>
-        <w:rPr>
-          <w:rStyle w:val="VerbatimChar"/>
-          <w:rFonts w:ascii="Times New Roman" w:hAnsi="Times New Roman"/>
-          <w:sz w:val="24"/>
-        </w:rPr>
-        <w:t xml:space="preserve">write_dict_to_file</w:t>
-      </w:r>
-      <w:r>
-        <w:rPr>
-          <w:rFonts w:ascii="Times New Roman" w:hAnsi="Times New Roman"/>
-          <w:sz w:val="24"/>
-        </w:rPr>
-        <w:t xml:space="preserve"> </w:t>
-      </w:r>
-      <w:r>
-        <w:rPr>
-          <w:rFonts w:ascii="Times New Roman" w:hAnsi="Times New Roman"/>
-          <w:sz w:val="24"/>
-        </w:rPr>
-        <w:t xml:space="preserve">function opens</w:t>
-      </w:r>
-      <w:r>
-        <w:rPr>
-          <w:rFonts w:ascii="Times New Roman" w:hAnsi="Times New Roman"/>
-          <w:sz w:val="24"/>
-        </w:rPr>
-        <w:t xml:space="preserve"> </w:t>
-      </w:r>
-      <w:r>
-        <w:rPr>
-          <w:rStyle w:val="VerbatimChar"/>
-          <w:rFonts w:ascii="Times New Roman" w:hAnsi="Times New Roman"/>
-          <w:sz w:val="24"/>
-        </w:rPr>
-        <w:t xml:space="preserve">fruits_inverted.txt</w:t>
-      </w:r>
-      <w:r>
-        <w:rPr>
-          <w:rFonts w:ascii="Times New Roman" w:hAnsi="Times New Roman"/>
-          <w:sz w:val="24"/>
-        </w:rPr>
-        <w:t xml:space="preserve"> </w:t>
-      </w:r>
-      <w:r>
-        <w:rPr>
-          <w:rFonts w:ascii="Times New Roman" w:hAnsi="Times New Roman"/>
-          <w:sz w:val="24"/>
-        </w:rPr>
-        <w:t xml:space="preserve">in write mode (</w:t>
-      </w:r>
-      <w:r>
-        <w:rPr>
-          <w:rStyle w:val="VerbatimChar"/>
-          <w:rFonts w:ascii="Times New Roman" w:hAnsi="Times New Roman"/>
-          <w:sz w:val="24"/>
-        </w:rPr>
-        <w:t xml:space="preserve">'w'</w:t>
-      </w:r>
-      <w:r>
-        <w:rPr>
-          <w:rFonts w:ascii="Times New Roman" w:hAnsi="Times New Roman"/>
-          <w:sz w:val="24"/>
-        </w:rPr>
-        <w:t xml:space="preserve">), which creates the file if it does not exist or overwrites it if it does (Schafer, 2016). For each color key, the list of fruit names is joined into a comma-separated string using</w:t>
-      </w:r>
-      <w:r>
-        <w:rPr>
-          <w:rFonts w:ascii="Times New Roman" w:hAnsi="Times New Roman"/>
-          <w:sz w:val="24"/>
-        </w:rPr>
-        <w:t xml:space="preserve"> </w:t>
-      </w:r>
-      <w:r>
-        <w:rPr>
-          <w:rStyle w:val="VerbatimChar"/>
-          <w:rFonts w:ascii="Times New Roman" w:hAnsi="Times New Roman"/>
-          <w:sz w:val="24"/>
-        </w:rPr>
-        <w:t xml:space="preserve">', '.join(values)</w:t>
-      </w:r>
-      <w:r>
-        <w:rPr>
-          <w:rFonts w:ascii="Times New Roman" w:hAnsi="Times New Roman"/>
-          <w:sz w:val="24"/>
-        </w:rPr>
-        <w:t xml:space="preserve">, then written as a single line followed by a newline character</w:t>
-      </w:r>
-      <w:r>
-        <w:rPr>
-          <w:rFonts w:ascii="Times New Roman" w:hAnsi="Times New Roman"/>
-          <w:sz w:val="24"/>
-        </w:rPr>
-        <w:t xml:space="preserve"> </w:t>
-      </w:r>
-      <w:r>
-        <w:rPr>
-          <w:rStyle w:val="VerbatimChar"/>
-          <w:rFonts w:ascii="Times New Roman" w:hAnsi="Times New Roman"/>
-          <w:sz w:val="24"/>
-        </w:rPr>
-        <w:t xml:space="preserve">'\n'</w:t>
+          <w:sz w:val="24"/>
+        </w:rPr>
+        <w:t xml:space="preserve">Inside the</w:t>
+      </w:r>
+      <w:r>
+        <w:rPr>
+          <w:rFonts w:ascii="Times New Roman" w:hAnsi="Times New Roman"/>
+          <w:sz w:val="24"/>
+        </w:rPr>
+        <w:t xml:space="preserve"> </w:t>
+      </w:r>
+      <w:r>
+        <w:rPr>
+          <w:rStyle w:val="VerbatimChar"/>
+          <w:rFonts w:ascii="Times New Roman" w:hAnsi="Times New Roman"/>
+          <w:sz w:val="24"/>
+        </w:rPr>
+        <w:t xml:space="preserve">with</w:t>
+      </w:r>
+      <w:r>
+        <w:rPr>
+          <w:rFonts w:ascii="Times New Roman" w:hAnsi="Times New Roman"/>
+          <w:sz w:val="24"/>
+        </w:rPr>
+        <w:t xml:space="preserve"> </w:t>
+      </w:r>
+      <w:r>
+        <w:rPr>
+          <w:rFonts w:ascii="Times New Roman" w:hAnsi="Times New Roman"/>
+          <w:sz w:val="24"/>
+        </w:rPr>
+        <w:t xml:space="preserve">block, the function iterates over the file line by line using a</w:t>
+      </w:r>
+      <w:r>
+        <w:rPr>
+          <w:rFonts w:ascii="Times New Roman" w:hAnsi="Times New Roman"/>
+          <w:sz w:val="24"/>
+        </w:rPr>
+        <w:t xml:space="preserve"> </w:t>
+      </w:r>
+      <w:r>
+        <w:rPr>
+          <w:rStyle w:val="VerbatimChar"/>
+          <w:rFonts w:ascii="Times New Roman" w:hAnsi="Times New Roman"/>
+          <w:sz w:val="24"/>
+        </w:rPr>
+        <w:t xml:space="preserve">for</w:t>
+      </w:r>
+      <w:r>
+        <w:rPr>
+          <w:rFonts w:ascii="Times New Roman" w:hAnsi="Times New Roman"/>
+          <w:sz w:val="24"/>
+        </w:rPr>
+        <w:t xml:space="preserve"> </w:t>
+      </w:r>
+      <w:r>
+        <w:rPr>
+          <w:rFonts w:ascii="Times New Roman" w:hAnsi="Times New Roman"/>
+          <w:sz w:val="24"/>
+        </w:rPr>
+        <w:t xml:space="preserve">loop. This is more memory-efficient than reading the entire file at once with</w:t>
+      </w:r>
+      <w:r>
+        <w:rPr>
+          <w:rFonts w:ascii="Times New Roman" w:hAnsi="Times New Roman"/>
+          <w:sz w:val="24"/>
+        </w:rPr>
+        <w:t xml:space="preserve"> </w:t>
+      </w:r>
+      <w:r>
+        <w:rPr>
+          <w:rStyle w:val="VerbatimChar"/>
+          <w:rFonts w:ascii="Times New Roman" w:hAnsi="Times New Roman"/>
+          <w:sz w:val="24"/>
+        </w:rPr>
+        <w:t xml:space="preserve">f.read()</w:t>
+      </w:r>
+      <w:r>
+        <w:rPr>
+          <w:rFonts w:ascii="Times New Roman" w:hAnsi="Times New Roman"/>
+          <w:sz w:val="24"/>
+        </w:rPr>
+        <w:t xml:space="preserve">, because Python loads only one line into memory at a time — an important consideration when working with large files (Schafer, 2016). Each line is processed with</w:t>
+      </w:r>
+      <w:r>
+        <w:rPr>
+          <w:rFonts w:ascii="Times New Roman" w:hAnsi="Times New Roman"/>
+          <w:sz w:val="24"/>
+        </w:rPr>
+        <w:t xml:space="preserve"> </w:t>
+      </w:r>
+      <w:r>
+        <w:rPr>
+          <w:rStyle w:val="VerbatimChar"/>
+          <w:rFonts w:ascii="Times New Roman" w:hAnsi="Times New Roman"/>
+          <w:sz w:val="24"/>
+        </w:rPr>
+        <w:t xml:space="preserve">.strip()</w:t>
+      </w:r>
+      <w:r>
+        <w:rPr>
+          <w:rFonts w:ascii="Times New Roman" w:hAnsi="Times New Roman"/>
+          <w:sz w:val="24"/>
+        </w:rPr>
+        <w:t xml:space="preserve"> </w:t>
+      </w:r>
+      <w:r>
+        <w:rPr>
+          <w:rFonts w:ascii="Times New Roman" w:hAnsi="Times New Roman"/>
+          <w:sz w:val="24"/>
+        </w:rPr>
+        <w:t xml:space="preserve">to remove leading and trailing whitespace, including the newline character</w:t>
+      </w:r>
+      <w:r>
+        <w:rPr>
+          <w:rFonts w:ascii="Times New Roman" w:hAnsi="Times New Roman"/>
+          <w:sz w:val="24"/>
+        </w:rPr>
+        <w:t xml:space="preserve"> </w:t>
+      </w:r>
+      <w:r>
+        <w:rPr>
+          <w:rStyle w:val="VerbatimChar"/>
+          <w:rFonts w:ascii="Times New Roman" w:hAnsi="Times New Roman"/>
+          <w:sz w:val="24"/>
+        </w:rPr>
+        <w:t xml:space="preserve">\n</w:t>
+      </w:r>
+      <w:r>
+        <w:rPr>
+          <w:rFonts w:ascii="Times New Roman" w:hAnsi="Times New Roman"/>
+          <w:sz w:val="24"/>
+        </w:rPr>
+        <w:t xml:space="preserve"> </w:t>
+      </w:r>
+      <w:r>
+        <w:rPr>
+          <w:rFonts w:ascii="Times New Roman" w:hAnsi="Times New Roman"/>
+          <w:sz w:val="24"/>
+        </w:rPr>
+        <w:t xml:space="preserve">that Python includes at the end of each line it reads. Lines that are blank after stripping are skipped with</w:t>
+      </w:r>
+      <w:r>
+        <w:rPr>
+          <w:rFonts w:ascii="Times New Roman" w:hAnsi="Times New Roman"/>
+          <w:sz w:val="24"/>
+        </w:rPr>
+        <w:t xml:space="preserve"> </w:t>
+      </w:r>
+      <w:r>
+        <w:rPr>
+          <w:rStyle w:val="VerbatimChar"/>
+          <w:rFonts w:ascii="Times New Roman" w:hAnsi="Times New Roman"/>
+          <w:sz w:val="24"/>
+        </w:rPr>
+        <w:t xml:space="preserve">continue</w:t>
+      </w:r>
+      <w:r>
+        <w:rPr>
+          <w:rFonts w:ascii="Times New Roman" w:hAnsi="Times New Roman"/>
+          <w:sz w:val="24"/>
+        </w:rPr>
+        <w:t xml:space="preserve">, as are lines that do not contain a colon — this defensive check prevents the program from crashing on malformed input. The remaining lines are split on the first colon using</w:t>
+      </w:r>
+      <w:r>
+        <w:rPr>
+          <w:rFonts w:ascii="Times New Roman" w:hAnsi="Times New Roman"/>
+          <w:sz w:val="24"/>
+        </w:rPr>
+        <w:t xml:space="preserve"> </w:t>
+      </w:r>
+      <w:r>
+        <w:rPr>
+          <w:rStyle w:val="VerbatimChar"/>
+          <w:rFonts w:ascii="Times New Roman" w:hAnsi="Times New Roman"/>
+          <w:sz w:val="24"/>
+        </w:rPr>
+        <w:t xml:space="preserve">line.split(':', 1)</w:t>
+      </w:r>
+      <w:r>
+        <w:rPr>
+          <w:rFonts w:ascii="Times New Roman" w:hAnsi="Times New Roman"/>
+          <w:sz w:val="24"/>
+        </w:rPr>
+        <w:t xml:space="preserve">. The</w:t>
+      </w:r>
+      <w:r>
+        <w:rPr>
+          <w:rFonts w:ascii="Times New Roman" w:hAnsi="Times New Roman"/>
+          <w:sz w:val="24"/>
+        </w:rPr>
+        <w:t xml:space="preserve"> </w:t>
+      </w:r>
+      <w:r>
+        <w:rPr>
+          <w:rStyle w:val="VerbatimChar"/>
+          <w:rFonts w:ascii="Times New Roman" w:hAnsi="Times New Roman"/>
+          <w:sz w:val="24"/>
+        </w:rPr>
+        <w:t xml:space="preserve">1</w:t>
+      </w:r>
+      <w:r>
+        <w:rPr>
+          <w:rFonts w:ascii="Times New Roman" w:hAnsi="Times New Roman"/>
+          <w:sz w:val="24"/>
+        </w:rPr>
+        <w:t xml:space="preserve"> </w:t>
+      </w:r>
+      <w:r>
+        <w:rPr>
+          <w:rFonts w:ascii="Times New Roman" w:hAnsi="Times New Roman"/>
+          <w:sz w:val="24"/>
+        </w:rPr>
+        <w:t xml:space="preserve">argument is important: it limits the split to a single occurrence, so a value that itself contains a colon — such as a URL — would not be incorrectly split into three parts. The resulting key and value are stripped of any extra whitespace and stored in the dictionary</w:t>
+      </w:r>
+      <w:r>
+        <w:rPr>
+          <w:rFonts w:ascii="Times New Roman" w:hAnsi="Times New Roman"/>
+          <w:sz w:val="24"/>
+        </w:rPr>
+        <w:t xml:space="preserve"> </w:t>
+      </w:r>
+      <w:r>
+        <w:rPr>
+          <w:rStyle w:val="VerbatimChar"/>
+          <w:rFonts w:ascii="Times New Roman" w:hAnsi="Times New Roman"/>
+          <w:sz w:val="24"/>
+        </w:rPr>
+        <w:t xml:space="preserve">d</w:t>
       </w:r>
       <w:r>
         <w:rPr>
@@ -4132,261 +4076,7 @@
           <w:bCs/>
           <w:sz w:val="24"/>
         </w:rPr>
-        <w:t xml:space="preserve">Exception handling</w:t>
-      </w:r>
-      <w:r>
-        <w:rPr>
-          <w:rFonts w:ascii="Times New Roman" w:hAnsi="Times New Roman"/>
-          <w:sz w:val="24"/>
-        </w:rPr>
-        <w:t xml:space="preserve">: Both file functions wrap their</w:t>
-      </w:r>
-      <w:r>
-        <w:rPr>
-          <w:rFonts w:ascii="Times New Roman" w:hAnsi="Times New Roman"/>
-          <w:sz w:val="24"/>
-        </w:rPr>
-        <w:t xml:space="preserve"> </w:t>
-      </w:r>
-      <w:r>
-        <w:rPr>
-          <w:rStyle w:val="VerbatimChar"/>
-          <w:rFonts w:ascii="Times New Roman" w:hAnsi="Times New Roman"/>
-          <w:sz w:val="24"/>
-        </w:rPr>
-        <w:t xml:space="preserve">open()</w:t>
-      </w:r>
-      <w:r>
-        <w:rPr>
-          <w:rFonts w:ascii="Times New Roman" w:hAnsi="Times New Roman"/>
-          <w:sz w:val="24"/>
-        </w:rPr>
-        <w:t xml:space="preserve"> </w:t>
-      </w:r>
-      <w:r>
-        <w:rPr>
-          <w:rFonts w:ascii="Times New Roman" w:hAnsi="Times New Roman"/>
-          <w:sz w:val="24"/>
-        </w:rPr>
-        <w:t xml:space="preserve">calls in</w:t>
-      </w:r>
-      <w:r>
-        <w:rPr>
-          <w:rFonts w:ascii="Times New Roman" w:hAnsi="Times New Roman"/>
-          <w:sz w:val="24"/>
-        </w:rPr>
-        <w:t xml:space="preserve"> </w:t>
-      </w:r>
-      <w:r>
-        <w:rPr>
-          <w:rStyle w:val="VerbatimChar"/>
-          <w:rFonts w:ascii="Times New Roman" w:hAnsi="Times New Roman"/>
-          <w:sz w:val="24"/>
-        </w:rPr>
-        <w:t xml:space="preserve">try</w:t>
-      </w:r>
-      <w:r>
-        <w:rPr>
-          <w:rFonts w:ascii="Times New Roman" w:hAnsi="Times New Roman"/>
-          <w:sz w:val="24"/>
-        </w:rPr>
-        <w:t xml:space="preserve">/</w:t>
-      </w:r>
-      <w:r>
-        <w:rPr>
-          <w:rStyle w:val="VerbatimChar"/>
-          <w:rFonts w:ascii="Times New Roman" w:hAnsi="Times New Roman"/>
-          <w:sz w:val="24"/>
-        </w:rPr>
-        <w:t xml:space="preserve">except</w:t>
-      </w:r>
-      <w:r>
-        <w:rPr>
-          <w:rFonts w:ascii="Times New Roman" w:hAnsi="Times New Roman"/>
-          <w:sz w:val="24"/>
-        </w:rPr>
-        <w:t xml:space="preserve"> </w:t>
-      </w:r>
-      <w:r>
-        <w:rPr>
-          <w:rFonts w:ascii="Times New Roman" w:hAnsi="Times New Roman"/>
-          <w:sz w:val="24"/>
-        </w:rPr>
-        <w:t xml:space="preserve">blocks.</w:t>
-      </w:r>
-      <w:r>
-        <w:rPr>
-          <w:rFonts w:ascii="Times New Roman" w:hAnsi="Times New Roman"/>
-          <w:sz w:val="24"/>
-        </w:rPr>
-        <w:t xml:space="preserve"> </w:t>
-      </w:r>
-      <w:r>
-        <w:rPr>
-          <w:rStyle w:val="VerbatimChar"/>
-          <w:rFonts w:ascii="Times New Roman" w:hAnsi="Times New Roman"/>
-          <w:sz w:val="24"/>
-        </w:rPr>
-        <w:t xml:space="preserve">FileNotFoundError</w:t>
-      </w:r>
-      <w:r>
-        <w:rPr>
-          <w:rFonts w:ascii="Times New Roman" w:hAnsi="Times New Roman"/>
-          <w:sz w:val="24"/>
-        </w:rPr>
-        <w:t xml:space="preserve"> </w:t>
-      </w:r>
-      <w:r>
-        <w:rPr>
-          <w:rFonts w:ascii="Times New Roman" w:hAnsi="Times New Roman"/>
-          <w:sz w:val="24"/>
-        </w:rPr>
-        <w:t xml:space="preserve">is caught in the read function to handle the case where</w:t>
-      </w:r>
-      <w:r>
-        <w:rPr>
-          <w:rFonts w:ascii="Times New Roman" w:hAnsi="Times New Roman"/>
-          <w:sz w:val="24"/>
-        </w:rPr>
-        <w:t xml:space="preserve"> </w:t>
-      </w:r>
-      <w:r>
-        <w:rPr>
-          <w:rStyle w:val="VerbatimChar"/>
-          <w:rFonts w:ascii="Times New Roman" w:hAnsi="Times New Roman"/>
-          <w:sz w:val="24"/>
-        </w:rPr>
-        <w:t xml:space="preserve">fruits.txt</w:t>
-      </w:r>
-      <w:r>
-        <w:rPr>
-          <w:rFonts w:ascii="Times New Roman" w:hAnsi="Times New Roman"/>
-          <w:sz w:val="24"/>
-        </w:rPr>
-        <w:t xml:space="preserve"> </w:t>
-      </w:r>
-      <w:r>
-        <w:rPr>
-          <w:rFonts w:ascii="Times New Roman" w:hAnsi="Times New Roman"/>
-          <w:sz w:val="24"/>
-        </w:rPr>
-        <w:t xml:space="preserve">does not exist.</w:t>
-      </w:r>
-      <w:r>
-        <w:rPr>
-          <w:rFonts w:ascii="Times New Roman" w:hAnsi="Times New Roman"/>
-          <w:sz w:val="24"/>
-        </w:rPr>
-        <w:t xml:space="preserve"> </w:t>
-      </w:r>
-      <w:r>
-        <w:rPr>
-          <w:rStyle w:val="VerbatimChar"/>
-          <w:rFonts w:ascii="Times New Roman" w:hAnsi="Times New Roman"/>
-          <w:sz w:val="24"/>
-        </w:rPr>
-        <w:t xml:space="preserve">PermissionError</w:t>
-      </w:r>
-      <w:r>
-        <w:rPr>
-          <w:rFonts w:ascii="Times New Roman" w:hAnsi="Times New Roman"/>
-          <w:sz w:val="24"/>
-        </w:rPr>
-        <w:t xml:space="preserve"> </w:t>
-      </w:r>
-      <w:r>
-        <w:rPr>
-          <w:rFonts w:ascii="Times New Roman" w:hAnsi="Times New Roman"/>
-          <w:sz w:val="24"/>
-        </w:rPr>
-        <w:t xml:space="preserve">is caught in both functions to handle access restriction errors. As Downey (2015) explains, catching specific named exceptions — rather than using a bare</w:t>
-      </w:r>
-      <w:r>
-        <w:rPr>
-          <w:rFonts w:ascii="Times New Roman" w:hAnsi="Times New Roman"/>
-          <w:sz w:val="24"/>
-        </w:rPr>
-        <w:t xml:space="preserve"> </w:t>
-      </w:r>
-      <w:r>
-        <w:rPr>
-          <w:rStyle w:val="VerbatimChar"/>
-          <w:rFonts w:ascii="Times New Roman" w:hAnsi="Times New Roman"/>
-          <w:sz w:val="24"/>
-        </w:rPr>
-        <w:t xml:space="preserve">except:</w:t>
-      </w:r>
-      <w:r>
-        <w:rPr>
-          <w:rFonts w:ascii="Times New Roman" w:hAnsi="Times New Roman"/>
-          <w:sz w:val="24"/>
-        </w:rPr>
-        <w:t xml:space="preserve"> </w:t>
-      </w:r>
-      <w:r>
-        <w:rPr>
-          <w:rFonts w:ascii="Times New Roman" w:hAnsi="Times New Roman"/>
-          <w:sz w:val="24"/>
-        </w:rPr>
-        <w:t xml:space="preserve">— is best practice because it allows unexpected errors to propagate normally rather than being silently swallowed (p. 145). The</w:t>
-      </w:r>
-      <w:r>
-        <w:rPr>
-          <w:rFonts w:ascii="Times New Roman" w:hAnsi="Times New Roman"/>
-          <w:sz w:val="24"/>
-        </w:rPr>
-        <w:t xml:space="preserve"> </w:t>
-      </w:r>
-      <w:r>
-        <w:rPr>
-          <w:rStyle w:val="VerbatimChar"/>
-          <w:rFonts w:ascii="Times New Roman" w:hAnsi="Times New Roman"/>
-          <w:sz w:val="24"/>
-        </w:rPr>
-        <w:t xml:space="preserve">read_dict_from_file</w:t>
-      </w:r>
-      <w:r>
-        <w:rPr>
-          <w:rFonts w:ascii="Times New Roman" w:hAnsi="Times New Roman"/>
-          <w:sz w:val="24"/>
-        </w:rPr>
-        <w:t xml:space="preserve"> </w:t>
-      </w:r>
-      <w:r>
-        <w:rPr>
-          <w:rFonts w:ascii="Times New Roman" w:hAnsi="Times New Roman"/>
-          <w:sz w:val="24"/>
-        </w:rPr>
-        <w:t xml:space="preserve">function returns an empty dictionary</w:t>
-      </w:r>
-      <w:r>
-        <w:rPr>
-          <w:rFonts w:ascii="Times New Roman" w:hAnsi="Times New Roman"/>
-          <w:sz w:val="24"/>
-        </w:rPr>
-        <w:t xml:space="preserve"> </w:t>
-      </w:r>
-      <w:r>
-        <w:rPr>
-          <w:rStyle w:val="VerbatimChar"/>
-          <w:rFonts w:ascii="Times New Roman" w:hAnsi="Times New Roman"/>
-          <w:sz w:val="24"/>
-        </w:rPr>
-        <w:t xml:space="preserve">{}</w:t>
-      </w:r>
-      <w:r>
-        <w:rPr>
-          <w:rFonts w:ascii="Times New Roman" w:hAnsi="Times New Roman"/>
-          <w:sz w:val="24"/>
-        </w:rPr>
-        <w:t xml:space="preserve"> </w:t>
-      </w:r>
-      <w:r>
-        <w:rPr>
-          <w:rFonts w:ascii="Times New Roman" w:hAnsi="Times New Roman"/>
-          <w:sz w:val="24"/>
-        </w:rPr>
-        <w:t xml:space="preserve">if an error occurs, allowing the rest of the program to handle the empty result gracefully rather than crashing.</w:t>
+        <w:t xml:space="preserve">Inverting the dictionary</w:t>
       </w:r>
     </w:p>
     <w:p>
@@ -4399,7 +4089,796 @@
           <w:rFonts w:ascii="Times New Roman" w:hAnsi="Times New Roman"/>
           <w:sz w:val="24"/>
         </w:rPr>
-        <w:t xml:space="preserve">The program cleanly separates its three responsibilities — reading, inverting, and writing — into three distinct functions, making each independently testable and reusable. This modular design reflects the structured programming principles covered throughout CS1101.</w:t>
+        <w:t xml:space="preserve">The</w:t>
+      </w:r>
+      <w:r>
+        <w:rPr>
+          <w:rFonts w:ascii="Times New Roman" w:hAnsi="Times New Roman"/>
+          <w:sz w:val="24"/>
+        </w:rPr>
+        <w:t xml:space="preserve"> </w:t>
+      </w:r>
+      <w:r>
+        <w:rPr>
+          <w:rStyle w:val="VerbatimChar"/>
+          <w:rFonts w:ascii="Times New Roman" w:hAnsi="Times New Roman"/>
+          <w:sz w:val="24"/>
+        </w:rPr>
+        <w:t xml:space="preserve">invert_dict</w:t>
+      </w:r>
+      <w:r>
+        <w:rPr>
+          <w:rFonts w:ascii="Times New Roman" w:hAnsi="Times New Roman"/>
+          <w:sz w:val="24"/>
+        </w:rPr>
+        <w:t xml:space="preserve"> </w:t>
+      </w:r>
+      <w:r>
+        <w:rPr>
+          <w:rFonts w:ascii="Times New Roman" w:hAnsi="Times New Roman"/>
+          <w:sz w:val="24"/>
+        </w:rPr>
+        <w:t xml:space="preserve">function iterates over the original dictionary using</w:t>
+      </w:r>
+      <w:r>
+        <w:rPr>
+          <w:rFonts w:ascii="Times New Roman" w:hAnsi="Times New Roman"/>
+          <w:sz w:val="24"/>
+        </w:rPr>
+        <w:t xml:space="preserve"> </w:t>
+      </w:r>
+      <w:r>
+        <w:rPr>
+          <w:rStyle w:val="VerbatimChar"/>
+          <w:rFonts w:ascii="Times New Roman" w:hAnsi="Times New Roman"/>
+          <w:sz w:val="24"/>
+        </w:rPr>
+        <w:t xml:space="preserve">.items()</w:t>
+      </w:r>
+      <w:r>
+        <w:rPr>
+          <w:rFonts w:ascii="Times New Roman" w:hAnsi="Times New Roman"/>
+          <w:sz w:val="24"/>
+        </w:rPr>
+        <w:t xml:space="preserve">, which yields each key-value pair as a tuple on every iteration. For each pair, the original value (the color) becomes the new key in the</w:t>
+      </w:r>
+      <w:r>
+        <w:rPr>
+          <w:rFonts w:ascii="Times New Roman" w:hAnsi="Times New Roman"/>
+          <w:sz w:val="24"/>
+        </w:rPr>
+        <w:t xml:space="preserve"> </w:t>
+      </w:r>
+      <w:r>
+        <w:rPr>
+          <w:rStyle w:val="VerbatimChar"/>
+          <w:rFonts w:ascii="Times New Roman" w:hAnsi="Times New Roman"/>
+          <w:sz w:val="24"/>
+        </w:rPr>
+        <w:t xml:space="preserve">inverse</w:t>
+      </w:r>
+      <w:r>
+        <w:rPr>
+          <w:rFonts w:ascii="Times New Roman" w:hAnsi="Times New Roman"/>
+          <w:sz w:val="24"/>
+        </w:rPr>
+        <w:t xml:space="preserve"> </w:t>
+      </w:r>
+      <w:r>
+        <w:rPr>
+          <w:rFonts w:ascii="Times New Roman" w:hAnsi="Times New Roman"/>
+          <w:sz w:val="24"/>
+        </w:rPr>
+        <w:t xml:space="preserve">dictionary, and the original key (the fruit name) is added to a list of values. The logic uses a conditional check: if the color has not been seen before, a new list is created containing just the current fruit; if the color already exists as a key, the current fruit is appended to the existing list. This check-and-append pattern is the standard way to build a dictionary of lists in Python (Downey, 2015, p. 143). The result is that</w:t>
+      </w:r>
+      <w:r>
+        <w:rPr>
+          <w:rFonts w:ascii="Times New Roman" w:hAnsi="Times New Roman"/>
+          <w:sz w:val="24"/>
+        </w:rPr>
+        <w:t xml:space="preserve"> </w:t>
+      </w:r>
+      <w:r>
+        <w:rPr>
+          <w:rStyle w:val="VerbatimChar"/>
+          <w:rFonts w:ascii="Times New Roman" w:hAnsi="Times New Roman"/>
+          <w:sz w:val="24"/>
+        </w:rPr>
+        <w:t xml:space="preserve">red</w:t>
+      </w:r>
+      <w:r>
+        <w:rPr>
+          <w:rFonts w:ascii="Times New Roman" w:hAnsi="Times New Roman"/>
+          <w:sz w:val="24"/>
+        </w:rPr>
+        <w:t xml:space="preserve"> </w:t>
+      </w:r>
+      <w:r>
+        <w:rPr>
+          <w:rFonts w:ascii="Times New Roman" w:hAnsi="Times New Roman"/>
+          <w:sz w:val="24"/>
+        </w:rPr>
+        <w:t xml:space="preserve">maps to</w:t>
+      </w:r>
+      <w:r>
+        <w:rPr>
+          <w:rFonts w:ascii="Times New Roman" w:hAnsi="Times New Roman"/>
+          <w:sz w:val="24"/>
+        </w:rPr>
+        <w:t xml:space="preserve"> </w:t>
+      </w:r>
+      <w:r>
+        <w:rPr>
+          <w:rStyle w:val="VerbatimChar"/>
+          <w:rFonts w:ascii="Times New Roman" w:hAnsi="Times New Roman"/>
+          <w:sz w:val="24"/>
+        </w:rPr>
+        <w:t xml:space="preserve">['apple', 'cherry']</w:t>
+      </w:r>
+      <w:r>
+        <w:rPr>
+          <w:rFonts w:ascii="Times New Roman" w:hAnsi="Times New Roman"/>
+          <w:sz w:val="24"/>
+        </w:rPr>
+        <w:t xml:space="preserve"> </w:t>
+      </w:r>
+      <w:r>
+        <w:rPr>
+          <w:rFonts w:ascii="Times New Roman" w:hAnsi="Times New Roman"/>
+          <w:sz w:val="24"/>
+        </w:rPr>
+        <w:t xml:space="preserve">and</w:t>
+      </w:r>
+      <w:r>
+        <w:rPr>
+          <w:rFonts w:ascii="Times New Roman" w:hAnsi="Times New Roman"/>
+          <w:sz w:val="24"/>
+        </w:rPr>
+        <w:t xml:space="preserve"> </w:t>
+      </w:r>
+      <w:r>
+        <w:rPr>
+          <w:rStyle w:val="VerbatimChar"/>
+          <w:rFonts w:ascii="Times New Roman" w:hAnsi="Times New Roman"/>
+          <w:sz w:val="24"/>
+        </w:rPr>
+        <w:t xml:space="preserve">yellow</w:t>
+      </w:r>
+      <w:r>
+        <w:rPr>
+          <w:rFonts w:ascii="Times New Roman" w:hAnsi="Times New Roman"/>
+          <w:sz w:val="24"/>
+        </w:rPr>
+        <w:t xml:space="preserve"> </w:t>
+      </w:r>
+      <w:r>
+        <w:rPr>
+          <w:rFonts w:ascii="Times New Roman" w:hAnsi="Times New Roman"/>
+          <w:sz w:val="24"/>
+        </w:rPr>
+        <w:t xml:space="preserve">maps to</w:t>
+      </w:r>
+      <w:r>
+        <w:rPr>
+          <w:rFonts w:ascii="Times New Roman" w:hAnsi="Times New Roman"/>
+          <w:sz w:val="24"/>
+        </w:rPr>
+        <w:t xml:space="preserve"> </w:t>
+      </w:r>
+      <w:r>
+        <w:rPr>
+          <w:rStyle w:val="VerbatimChar"/>
+          <w:rFonts w:ascii="Times New Roman" w:hAnsi="Times New Roman"/>
+          <w:sz w:val="24"/>
+        </w:rPr>
+        <w:t xml:space="preserve">['banana', 'mango', 'lemon']</w:t>
+      </w:r>
+      <w:r>
+        <w:rPr>
+          <w:rFonts w:ascii="Times New Roman" w:hAnsi="Times New Roman"/>
+          <w:sz w:val="24"/>
+        </w:rPr>
+        <w:t xml:space="preserve">, correctly grouping all fruits that share a color.</w:t>
+      </w:r>
+    </w:p>
+    <w:p>
+      <w:pPr>
+        <w:pStyle w:val="BodyText"/>
+        <w:spacing w:line="480" w:lineRule="auto" w:after="0"/>
+      </w:pPr>
+      <w:r>
+        <w:rPr>
+          <w:rFonts w:ascii="Times New Roman" w:hAnsi="Times New Roman"/>
+          <w:b/>
+          <w:bCs/>
+          <w:sz w:val="24"/>
+        </w:rPr>
+        <w:t xml:space="preserve">Writing the inverted dictionary to a file</w:t>
+      </w:r>
+    </w:p>
+    <w:p>
+      <w:pPr>
+        <w:pStyle w:val="BodyText"/>
+        <w:spacing w:line="480" w:lineRule="auto" w:after="0"/>
+      </w:pPr>
+      <w:r>
+        <w:rPr>
+          <w:rFonts w:ascii="Times New Roman" w:hAnsi="Times New Roman"/>
+          <w:sz w:val="24"/>
+        </w:rPr>
+        <w:t xml:space="preserve">The</w:t>
+      </w:r>
+      <w:r>
+        <w:rPr>
+          <w:rFonts w:ascii="Times New Roman" w:hAnsi="Times New Roman"/>
+          <w:sz w:val="24"/>
+        </w:rPr>
+        <w:t xml:space="preserve"> </w:t>
+      </w:r>
+      <w:r>
+        <w:rPr>
+          <w:rStyle w:val="VerbatimChar"/>
+          <w:rFonts w:ascii="Times New Roman" w:hAnsi="Times New Roman"/>
+          <w:sz w:val="24"/>
+        </w:rPr>
+        <w:t xml:space="preserve">write_dict_to_file</w:t>
+      </w:r>
+      <w:r>
+        <w:rPr>
+          <w:rFonts w:ascii="Times New Roman" w:hAnsi="Times New Roman"/>
+          <w:sz w:val="24"/>
+        </w:rPr>
+        <w:t xml:space="preserve"> </w:t>
+      </w:r>
+      <w:r>
+        <w:rPr>
+          <w:rFonts w:ascii="Times New Roman" w:hAnsi="Times New Roman"/>
+          <w:sz w:val="24"/>
+        </w:rPr>
+        <w:t xml:space="preserve">function opens</w:t>
+      </w:r>
+      <w:r>
+        <w:rPr>
+          <w:rFonts w:ascii="Times New Roman" w:hAnsi="Times New Roman"/>
+          <w:sz w:val="24"/>
+        </w:rPr>
+        <w:t xml:space="preserve"> </w:t>
+      </w:r>
+      <w:r>
+        <w:rPr>
+          <w:rStyle w:val="VerbatimChar"/>
+          <w:rFonts w:ascii="Times New Roman" w:hAnsi="Times New Roman"/>
+          <w:sz w:val="24"/>
+        </w:rPr>
+        <w:t xml:space="preserve">fruits_inverted.txt</w:t>
+      </w:r>
+      <w:r>
+        <w:rPr>
+          <w:rFonts w:ascii="Times New Roman" w:hAnsi="Times New Roman"/>
+          <w:sz w:val="24"/>
+        </w:rPr>
+        <w:t xml:space="preserve"> </w:t>
+      </w:r>
+      <w:r>
+        <w:rPr>
+          <w:rFonts w:ascii="Times New Roman" w:hAnsi="Times New Roman"/>
+          <w:sz w:val="24"/>
+        </w:rPr>
+        <w:t xml:space="preserve">in write mode (</w:t>
+      </w:r>
+      <w:r>
+        <w:rPr>
+          <w:rStyle w:val="VerbatimChar"/>
+          <w:rFonts w:ascii="Times New Roman" w:hAnsi="Times New Roman"/>
+          <w:sz w:val="24"/>
+        </w:rPr>
+        <w:t xml:space="preserve">'w'</w:t>
+      </w:r>
+      <w:r>
+        <w:rPr>
+          <w:rFonts w:ascii="Times New Roman" w:hAnsi="Times New Roman"/>
+          <w:sz w:val="24"/>
+        </w:rPr>
+        <w:t xml:space="preserve">). As W3Schools (n.d.) notes, write mode creates the file if it does not already exist, or overwrites it completely if it does — which is the correct behavior here since we always want a fresh output. For each color key, the list of fruit names is converted into a comma-separated string using</w:t>
+      </w:r>
+      <w:r>
+        <w:rPr>
+          <w:rFonts w:ascii="Times New Roman" w:hAnsi="Times New Roman"/>
+          <w:sz w:val="24"/>
+        </w:rPr>
+        <w:t xml:space="preserve"> </w:t>
+      </w:r>
+      <w:r>
+        <w:rPr>
+          <w:rStyle w:val="VerbatimChar"/>
+          <w:rFonts w:ascii="Times New Roman" w:hAnsi="Times New Roman"/>
+          <w:sz w:val="24"/>
+        </w:rPr>
+        <w:t xml:space="preserve">', '.join(values)</w:t>
+      </w:r>
+      <w:r>
+        <w:rPr>
+          <w:rFonts w:ascii="Times New Roman" w:hAnsi="Times New Roman"/>
+          <w:sz w:val="24"/>
+        </w:rPr>
+        <w:t xml:space="preserve">. The</w:t>
+      </w:r>
+      <w:r>
+        <w:rPr>
+          <w:rFonts w:ascii="Times New Roman" w:hAnsi="Times New Roman"/>
+          <w:sz w:val="24"/>
+        </w:rPr>
+        <w:t xml:space="preserve"> </w:t>
+      </w:r>
+      <w:r>
+        <w:rPr>
+          <w:rStyle w:val="VerbatimChar"/>
+          <w:rFonts w:ascii="Times New Roman" w:hAnsi="Times New Roman"/>
+          <w:sz w:val="24"/>
+        </w:rPr>
+        <w:t xml:space="preserve">join()</w:t>
+      </w:r>
+      <w:r>
+        <w:rPr>
+          <w:rFonts w:ascii="Times New Roman" w:hAnsi="Times New Roman"/>
+          <w:sz w:val="24"/>
+        </w:rPr>
+        <w:t xml:space="preserve"> </w:t>
+      </w:r>
+      <w:r>
+        <w:rPr>
+          <w:rFonts w:ascii="Times New Roman" w:hAnsi="Times New Roman"/>
+          <w:sz w:val="24"/>
+        </w:rPr>
+        <w:t xml:space="preserve">method is the idiomatic Python way to concatenate a list of strings with a separator, and it handles lists of any length without requiring a loop. Each formatted line is written to the file followed by</w:t>
+      </w:r>
+      <w:r>
+        <w:rPr>
+          <w:rFonts w:ascii="Times New Roman" w:hAnsi="Times New Roman"/>
+          <w:sz w:val="24"/>
+        </w:rPr>
+        <w:t xml:space="preserve"> </w:t>
+      </w:r>
+      <w:r>
+        <w:rPr>
+          <w:rStyle w:val="VerbatimChar"/>
+          <w:rFonts w:ascii="Times New Roman" w:hAnsi="Times New Roman"/>
+          <w:sz w:val="24"/>
+        </w:rPr>
+        <w:t xml:space="preserve">'\n'</w:t>
+      </w:r>
+      <w:r>
+        <w:rPr>
+          <w:rFonts w:ascii="Times New Roman" w:hAnsi="Times New Roman"/>
+          <w:sz w:val="24"/>
+        </w:rPr>
+        <w:t xml:space="preserve"> </w:t>
+      </w:r>
+      <w:r>
+        <w:rPr>
+          <w:rFonts w:ascii="Times New Roman" w:hAnsi="Times New Roman"/>
+          <w:sz w:val="24"/>
+        </w:rPr>
+        <w:t xml:space="preserve">to ensure each entry appears on its own line.</w:t>
+      </w:r>
+    </w:p>
+    <w:p>
+      <w:pPr>
+        <w:pStyle w:val="BodyText"/>
+        <w:spacing w:line="480" w:lineRule="auto" w:after="0"/>
+      </w:pPr>
+      <w:r>
+        <w:rPr>
+          <w:rFonts w:ascii="Times New Roman" w:hAnsi="Times New Roman"/>
+          <w:b/>
+          <w:bCs/>
+          <w:sz w:val="24"/>
+        </w:rPr>
+        <w:t xml:space="preserve">Exception handling</w:t>
+      </w:r>
+    </w:p>
+    <w:p>
+      <w:pPr>
+        <w:pStyle w:val="BodyText"/>
+        <w:spacing w:line="480" w:lineRule="auto" w:after="0"/>
+      </w:pPr>
+      <w:r>
+        <w:rPr>
+          <w:rFonts w:ascii="Times New Roman" w:hAnsi="Times New Roman"/>
+          <w:sz w:val="24"/>
+        </w:rPr>
+        <w:t xml:space="preserve">Both file-touching functions wrap their</w:t>
+      </w:r>
+      <w:r>
+        <w:rPr>
+          <w:rFonts w:ascii="Times New Roman" w:hAnsi="Times New Roman"/>
+          <w:sz w:val="24"/>
+        </w:rPr>
+        <w:t xml:space="preserve"> </w:t>
+      </w:r>
+      <w:r>
+        <w:rPr>
+          <w:rStyle w:val="VerbatimChar"/>
+          <w:rFonts w:ascii="Times New Roman" w:hAnsi="Times New Roman"/>
+          <w:sz w:val="24"/>
+        </w:rPr>
+        <w:t xml:space="preserve">open()</w:t>
+      </w:r>
+      <w:r>
+        <w:rPr>
+          <w:rFonts w:ascii="Times New Roman" w:hAnsi="Times New Roman"/>
+          <w:sz w:val="24"/>
+        </w:rPr>
+        <w:t xml:space="preserve"> </w:t>
+      </w:r>
+      <w:r>
+        <w:rPr>
+          <w:rFonts w:ascii="Times New Roman" w:hAnsi="Times New Roman"/>
+          <w:sz w:val="24"/>
+        </w:rPr>
+        <w:t xml:space="preserve">calls in</w:t>
+      </w:r>
+      <w:r>
+        <w:rPr>
+          <w:rFonts w:ascii="Times New Roman" w:hAnsi="Times New Roman"/>
+          <w:sz w:val="24"/>
+        </w:rPr>
+        <w:t xml:space="preserve"> </w:t>
+      </w:r>
+      <w:r>
+        <w:rPr>
+          <w:rStyle w:val="VerbatimChar"/>
+          <w:rFonts w:ascii="Times New Roman" w:hAnsi="Times New Roman"/>
+          <w:sz w:val="24"/>
+        </w:rPr>
+        <w:t xml:space="preserve">try</w:t>
+      </w:r>
+      <w:r>
+        <w:rPr>
+          <w:rFonts w:ascii="Times New Roman" w:hAnsi="Times New Roman"/>
+          <w:sz w:val="24"/>
+        </w:rPr>
+        <w:t xml:space="preserve">/</w:t>
+      </w:r>
+      <w:r>
+        <w:rPr>
+          <w:rStyle w:val="VerbatimChar"/>
+          <w:rFonts w:ascii="Times New Roman" w:hAnsi="Times New Roman"/>
+          <w:sz w:val="24"/>
+        </w:rPr>
+        <w:t xml:space="preserve">except</w:t>
+      </w:r>
+      <w:r>
+        <w:rPr>
+          <w:rFonts w:ascii="Times New Roman" w:hAnsi="Times New Roman"/>
+          <w:sz w:val="24"/>
+        </w:rPr>
+        <w:t xml:space="preserve"> </w:t>
+      </w:r>
+      <w:r>
+        <w:rPr>
+          <w:rFonts w:ascii="Times New Roman" w:hAnsi="Times New Roman"/>
+          <w:sz w:val="24"/>
+        </w:rPr>
+        <w:t xml:space="preserve">blocks with named exception types. In</w:t>
+      </w:r>
+      <w:r>
+        <w:rPr>
+          <w:rFonts w:ascii="Times New Roman" w:hAnsi="Times New Roman"/>
+          <w:sz w:val="24"/>
+        </w:rPr>
+        <w:t xml:space="preserve"> </w:t>
+      </w:r>
+      <w:r>
+        <w:rPr>
+          <w:rStyle w:val="VerbatimChar"/>
+          <w:rFonts w:ascii="Times New Roman" w:hAnsi="Times New Roman"/>
+          <w:sz w:val="24"/>
+        </w:rPr>
+        <w:t xml:space="preserve">read_dict_from_file</w:t>
+      </w:r>
+      <w:r>
+        <w:rPr>
+          <w:rFonts w:ascii="Times New Roman" w:hAnsi="Times New Roman"/>
+          <w:sz w:val="24"/>
+        </w:rPr>
+        <w:t xml:space="preserve">,</w:t>
+      </w:r>
+      <w:r>
+        <w:rPr>
+          <w:rFonts w:ascii="Times New Roman" w:hAnsi="Times New Roman"/>
+          <w:sz w:val="24"/>
+        </w:rPr>
+        <w:t xml:space="preserve"> </w:t>
+      </w:r>
+      <w:r>
+        <w:rPr>
+          <w:rStyle w:val="VerbatimChar"/>
+          <w:rFonts w:ascii="Times New Roman" w:hAnsi="Times New Roman"/>
+          <w:sz w:val="24"/>
+        </w:rPr>
+        <w:t xml:space="preserve">FileNotFoundError</w:t>
+      </w:r>
+      <w:r>
+        <w:rPr>
+          <w:rFonts w:ascii="Times New Roman" w:hAnsi="Times New Roman"/>
+          <w:sz w:val="24"/>
+        </w:rPr>
+        <w:t xml:space="preserve"> </w:t>
+      </w:r>
+      <w:r>
+        <w:rPr>
+          <w:rFonts w:ascii="Times New Roman" w:hAnsi="Times New Roman"/>
+          <w:sz w:val="24"/>
+        </w:rPr>
+        <w:t xml:space="preserve">is caught to handle the case where</w:t>
+      </w:r>
+      <w:r>
+        <w:rPr>
+          <w:rFonts w:ascii="Times New Roman" w:hAnsi="Times New Roman"/>
+          <w:sz w:val="24"/>
+        </w:rPr>
+        <w:t xml:space="preserve"> </w:t>
+      </w:r>
+      <w:r>
+        <w:rPr>
+          <w:rStyle w:val="VerbatimChar"/>
+          <w:rFonts w:ascii="Times New Roman" w:hAnsi="Times New Roman"/>
+          <w:sz w:val="24"/>
+        </w:rPr>
+        <w:t xml:space="preserve">fruits.txt</w:t>
+      </w:r>
+      <w:r>
+        <w:rPr>
+          <w:rFonts w:ascii="Times New Roman" w:hAnsi="Times New Roman"/>
+          <w:sz w:val="24"/>
+        </w:rPr>
+        <w:t xml:space="preserve"> </w:t>
+      </w:r>
+      <w:r>
+        <w:rPr>
+          <w:rFonts w:ascii="Times New Roman" w:hAnsi="Times New Roman"/>
+          <w:sz w:val="24"/>
+        </w:rPr>
+        <w:t xml:space="preserve">does not exist, and</w:t>
+      </w:r>
+      <w:r>
+        <w:rPr>
+          <w:rFonts w:ascii="Times New Roman" w:hAnsi="Times New Roman"/>
+          <w:sz w:val="24"/>
+        </w:rPr>
+        <w:t xml:space="preserve"> </w:t>
+      </w:r>
+      <w:r>
+        <w:rPr>
+          <w:rStyle w:val="VerbatimChar"/>
+          <w:rFonts w:ascii="Times New Roman" w:hAnsi="Times New Roman"/>
+          <w:sz w:val="24"/>
+        </w:rPr>
+        <w:t xml:space="preserve">PermissionError</w:t>
+      </w:r>
+      <w:r>
+        <w:rPr>
+          <w:rFonts w:ascii="Times New Roman" w:hAnsi="Times New Roman"/>
+          <w:sz w:val="24"/>
+        </w:rPr>
+        <w:t xml:space="preserve"> </w:t>
+      </w:r>
+      <w:r>
+        <w:rPr>
+          <w:rFonts w:ascii="Times New Roman" w:hAnsi="Times New Roman"/>
+          <w:sz w:val="24"/>
+        </w:rPr>
+        <w:t xml:space="preserve">is caught to handle access restriction. In</w:t>
+      </w:r>
+      <w:r>
+        <w:rPr>
+          <w:rFonts w:ascii="Times New Roman" w:hAnsi="Times New Roman"/>
+          <w:sz w:val="24"/>
+        </w:rPr>
+        <w:t xml:space="preserve"> </w:t>
+      </w:r>
+      <w:r>
+        <w:rPr>
+          <w:rStyle w:val="VerbatimChar"/>
+          <w:rFonts w:ascii="Times New Roman" w:hAnsi="Times New Roman"/>
+          <w:sz w:val="24"/>
+        </w:rPr>
+        <w:t xml:space="preserve">write_dict_to_file</w:t>
+      </w:r>
+      <w:r>
+        <w:rPr>
+          <w:rFonts w:ascii="Times New Roman" w:hAnsi="Times New Roman"/>
+          <w:sz w:val="24"/>
+        </w:rPr>
+        <w:t xml:space="preserve">,</w:t>
+      </w:r>
+      <w:r>
+        <w:rPr>
+          <w:rFonts w:ascii="Times New Roman" w:hAnsi="Times New Roman"/>
+          <w:sz w:val="24"/>
+        </w:rPr>
+        <w:t xml:space="preserve"> </w:t>
+      </w:r>
+      <w:r>
+        <w:rPr>
+          <w:rStyle w:val="VerbatimChar"/>
+          <w:rFonts w:ascii="Times New Roman" w:hAnsi="Times New Roman"/>
+          <w:sz w:val="24"/>
+        </w:rPr>
+        <w:t xml:space="preserve">PermissionError</w:t>
+      </w:r>
+      <w:r>
+        <w:rPr>
+          <w:rFonts w:ascii="Times New Roman" w:hAnsi="Times New Roman"/>
+          <w:sz w:val="24"/>
+        </w:rPr>
+        <w:t xml:space="preserve"> </w:t>
+      </w:r>
+      <w:r>
+        <w:rPr>
+          <w:rFonts w:ascii="Times New Roman" w:hAnsi="Times New Roman"/>
+          <w:sz w:val="24"/>
+        </w:rPr>
+        <w:t xml:space="preserve">is caught to handle the case where the program cannot write to the output location. As Downey (2015) explains, naming specific exceptions in</w:t>
+      </w:r>
+      <w:r>
+        <w:rPr>
+          <w:rFonts w:ascii="Times New Roman" w:hAnsi="Times New Roman"/>
+          <w:sz w:val="24"/>
+        </w:rPr>
+        <w:t xml:space="preserve"> </w:t>
+      </w:r>
+      <w:r>
+        <w:rPr>
+          <w:rStyle w:val="VerbatimChar"/>
+          <w:rFonts w:ascii="Times New Roman" w:hAnsi="Times New Roman"/>
+          <w:sz w:val="24"/>
+        </w:rPr>
+        <w:t xml:space="preserve">except</w:t>
+      </w:r>
+      <w:r>
+        <w:rPr>
+          <w:rFonts w:ascii="Times New Roman" w:hAnsi="Times New Roman"/>
+          <w:sz w:val="24"/>
+        </w:rPr>
+        <w:t xml:space="preserve"> </w:t>
+      </w:r>
+      <w:r>
+        <w:rPr>
+          <w:rFonts w:ascii="Times New Roman" w:hAnsi="Times New Roman"/>
+          <w:sz w:val="24"/>
+        </w:rPr>
+        <w:t xml:space="preserve">clauses — rather than using a bare</w:t>
+      </w:r>
+      <w:r>
+        <w:rPr>
+          <w:rFonts w:ascii="Times New Roman" w:hAnsi="Times New Roman"/>
+          <w:sz w:val="24"/>
+        </w:rPr>
+        <w:t xml:space="preserve"> </w:t>
+      </w:r>
+      <w:r>
+        <w:rPr>
+          <w:rStyle w:val="VerbatimChar"/>
+          <w:rFonts w:ascii="Times New Roman" w:hAnsi="Times New Roman"/>
+          <w:sz w:val="24"/>
+        </w:rPr>
+        <w:t xml:space="preserve">except:</w:t>
+      </w:r>
+      <w:r>
+        <w:rPr>
+          <w:rFonts w:ascii="Times New Roman" w:hAnsi="Times New Roman"/>
+          <w:sz w:val="24"/>
+        </w:rPr>
+        <w:t xml:space="preserve"> </w:t>
+      </w:r>
+      <w:r>
+        <w:rPr>
+          <w:rFonts w:ascii="Times New Roman" w:hAnsi="Times New Roman"/>
+          <w:sz w:val="24"/>
+        </w:rPr>
+        <w:t xml:space="preserve">— is best practice because it ensures that only anticipated errors are handled, while unexpected errors still propagate and get noticed (p. 145). If</w:t>
+      </w:r>
+      <w:r>
+        <w:rPr>
+          <w:rFonts w:ascii="Times New Roman" w:hAnsi="Times New Roman"/>
+          <w:sz w:val="24"/>
+        </w:rPr>
+        <w:t xml:space="preserve"> </w:t>
+      </w:r>
+      <w:r>
+        <w:rPr>
+          <w:rStyle w:val="VerbatimChar"/>
+          <w:rFonts w:ascii="Times New Roman" w:hAnsi="Times New Roman"/>
+          <w:sz w:val="24"/>
+        </w:rPr>
+        <w:t xml:space="preserve">read_dict_from_file</w:t>
+      </w:r>
+      <w:r>
+        <w:rPr>
+          <w:rFonts w:ascii="Times New Roman" w:hAnsi="Times New Roman"/>
+          <w:sz w:val="24"/>
+        </w:rPr>
+        <w:t xml:space="preserve"> </w:t>
+      </w:r>
+      <w:r>
+        <w:rPr>
+          <w:rFonts w:ascii="Times New Roman" w:hAnsi="Times New Roman"/>
+          <w:sz w:val="24"/>
+        </w:rPr>
+        <w:t xml:space="preserve">encounters an error, it returns an empty dictionary</w:t>
+      </w:r>
+      <w:r>
+        <w:rPr>
+          <w:rFonts w:ascii="Times New Roman" w:hAnsi="Times New Roman"/>
+          <w:sz w:val="24"/>
+        </w:rPr>
+        <w:t xml:space="preserve"> </w:t>
+      </w:r>
+      <w:r>
+        <w:rPr>
+          <w:rStyle w:val="VerbatimChar"/>
+          <w:rFonts w:ascii="Times New Roman" w:hAnsi="Times New Roman"/>
+          <w:sz w:val="24"/>
+        </w:rPr>
+        <w:t xml:space="preserve">{}</w:t>
+      </w:r>
+      <w:r>
+        <w:rPr>
+          <w:rFonts w:ascii="Times New Roman" w:hAnsi="Times New Roman"/>
+          <w:sz w:val="24"/>
+        </w:rPr>
+        <w:t xml:space="preserve"> </w:t>
+      </w:r>
+      <w:r>
+        <w:rPr>
+          <w:rFonts w:ascii="Times New Roman" w:hAnsi="Times New Roman"/>
+          <w:sz w:val="24"/>
+        </w:rPr>
+        <w:t xml:space="preserve">rather than crashing, which allows the rest of the program to handle the empty result gracefully.</w:t>
+      </w:r>
+    </w:p>
+    <w:p>
+      <w:pPr>
+        <w:pStyle w:val="BodyText"/>
+        <w:spacing w:line="480" w:lineRule="auto" w:after="0"/>
+      </w:pPr>
+      <w:r>
+        <w:rPr>
+          <w:rFonts w:ascii="Times New Roman" w:hAnsi="Times New Roman"/>
+          <w:sz w:val="24"/>
+        </w:rPr>
+        <w:t xml:space="preserve">The overall design — three focused functions, defensive input parsing, named exception handling, and the</w:t>
+      </w:r>
+      <w:r>
+        <w:rPr>
+          <w:rFonts w:ascii="Times New Roman" w:hAnsi="Times New Roman"/>
+          <w:sz w:val="24"/>
+        </w:rPr>
+        <w:t xml:space="preserve"> </w:t>
+      </w:r>
+      <w:r>
+        <w:rPr>
+          <w:rStyle w:val="VerbatimChar"/>
+          <w:rFonts w:ascii="Times New Roman" w:hAnsi="Times New Roman"/>
+          <w:sz w:val="24"/>
+        </w:rPr>
+        <w:t xml:space="preserve">with</w:t>
+      </w:r>
+      <w:r>
+        <w:rPr>
+          <w:rFonts w:ascii="Times New Roman" w:hAnsi="Times New Roman"/>
+          <w:sz w:val="24"/>
+        </w:rPr>
+        <w:t xml:space="preserve"> </w:t>
+      </w:r>
+      <w:r>
+        <w:rPr>
+          <w:rFonts w:ascii="Times New Roman" w:hAnsi="Times New Roman"/>
+          <w:sz w:val="24"/>
+        </w:rPr>
+        <w:t xml:space="preserve">statement for automatic resource management — reflects the programming principles covered throughout CS1101 and demonstrates how file I/O, dictionary operations, and exception handling work together in a complete, practical program.</w:t>
       </w:r>
     </w:p>
     <w:p>
@@ -4586,7 +5065,7 @@
           <w:rFonts w:ascii="Times New Roman" w:hAnsi="Times New Roman"/>
           <w:sz w:val="24"/>
         </w:rPr>
-        <w:t xml:space="preserve">: ~560 words (explanation section, excluding code, title, and references)</w:t>
+        <w:t xml:space="preserve">: ~750 words (explanation section, excluding code, title, and references)</w:t>
       </w:r>
     </w:p>
     <w:bookmarkEnd w:id="15"/>

</xml_diff>